<commit_message>
Revise Cell-GPS manual title and methods context
</commit_message>
<xml_diff>
--- a/docs/cellgps_build_and_run_guide_en.docx
+++ b/docs/cellgps_build_and_run_guide_en.docx
@@ -2,13 +2,13 @@
 <file path=word/document.xml><?xml version="1.0" encoding="utf-8"?>
 <w:document xmlns:w="http://schemas.openxmlformats.org/wordprocessingml/2006/main" xmlns:m="http://schemas.openxmlformats.org/officeDocument/2006/math" xmlns:r="http://schemas.openxmlformats.org/officeDocument/2006/relationships" xmlns:o="urn:schemas-microsoft-com:office:office" xmlns:v="urn:schemas-microsoft-com:vml" xmlns:w10="urn:schemas-microsoft-com:office:word" xmlns:a="http://schemas.openxmlformats.org/drawingml/2006/main" xmlns:pic="http://schemas.openxmlformats.org/drawingml/2006/picture" xmlns:wp="http://schemas.openxmlformats.org/drawingml/2006/wordprocessingDrawing">
   <w:body>
-    <w:bookmarkStart w:id="38" w:name="cellgps-build-notes-and-user-guide"/>
+    <w:bookmarkStart w:id="41" w:name="Xe3d21ff3f7ff467bf76a45b44e800d9956f5b46"/>
     <w:p>
       <w:pPr>
         <w:pStyle w:val="Heading1"/>
       </w:pPr>
       <w:r>
-        <w:t xml:space="preserve">Cell-GPS Build Notes and User Guide</w:t>
+        <w:t xml:space="preserve">Cell-GPS/COSTE Manual: Topology-Based Spatial Omics Analysis from Coordinates to StructureMap</w:t>
       </w:r>
     </w:p>
     <w:bookmarkStart w:id="9" w:name="executive-summary"/>
@@ -25,6 +25,22 @@
         <w:pStyle w:val="FirstParagraph"/>
       </w:pPr>
       <w:r>
+        <w:t xml:space="preserve">Cell-GPS is the reference software implementation for Cophenetic Spatial Topology Embedding (COSTE), a method for converting spatial omics coordinates and biological labels into tissue-scale topology summaries. The associated methods article presents COSTE as a general framework for measuring multiscale tissue architecture, generating StructureMap heatmaps and Spatial Separation Score (SSS) profiles, and extending the same coordinate-based logic to cells, transcripts, pathways, ligand-receptor candidates and other spatial entities.</w:t>
+      </w:r>
+    </w:p>
+    <w:p>
+      <w:pPr>
+        <w:pStyle w:val="BodyText"/>
+      </w:pPr>
+      <w:r>
+        <w:t xml:space="preserve">This manual is the practical companion to that methods article. It explains what the Windows executable contains, how it should be distributed, which workflows are exposed in the current graphical interface and how users should describe the standalone build accurately.</w:t>
+      </w:r>
+    </w:p>
+    <w:p>
+      <w:pPr>
+        <w:pStyle w:val="BodyText"/>
+      </w:pPr>
+      <w:r>
         <w:rPr>
           <w:rStyle w:val="VerbatimChar"/>
         </w:rPr>
@@ -43,7 +59,7 @@
         <w:rPr>
           <w:rStyle w:val="VerbatimChar"/>
         </w:rPr>
-        <w:t xml:space="preserve">cellgps</w:t>
+        <w:t xml:space="preserve">Cell-GPS</w:t>
       </w:r>
       <w:r>
         <w:t xml:space="preserve"> </w:t>
@@ -146,13 +162,13 @@
       </w:r>
     </w:p>
     <w:bookmarkEnd w:id="9"/>
-    <w:bookmarkStart w:id="10" w:name="build-characteristics"/>
+    <w:bookmarkStart w:id="10" w:name="method-article-context"/>
     <w:p>
       <w:pPr>
         <w:pStyle w:val="Heading2"/>
       </w:pPr>
       <w:r>
-        <w:t xml:space="preserve">2. Build Characteristics</w:t>
+        <w:t xml:space="preserve">2. Method Article Context</w:t>
       </w:r>
     </w:p>
     <w:p>
@@ -160,7 +176,56 @@
         <w:pStyle w:val="FirstParagraph"/>
       </w:pPr>
       <w:r>
-        <w:t xml:space="preserve">The optimized build produced from this repository has the following characteristics:</w:t>
+        <w:t xml:space="preserve">The methods article should be described as a spatial-omics topology paper rather than a conventional clustering or visualization report. Its central claim is that tissue organization can be quantified by asking how annotated spatial entities find one another across the tissue field, transforming directed nearest-neighbor relationships into a cophenetic topology space. In this framework, a StructureMap summarizes relationships among populations, while SSS profiles quantify how close one entity is to biologically meaningful reference groups.</w:t>
+      </w:r>
+    </w:p>
+    <w:p>
+      <w:pPr>
+        <w:pStyle w:val="BodyText"/>
+      </w:pPr>
+      <w:r>
+        <w:t xml:space="preserve">Cell-GPS provides the software route from input coordinates to these outputs. It can operate on simple coordinate tables,</w:t>
+      </w:r>
+      <w:r>
+        <w:t xml:space="preserve"> </w:t>
+      </w:r>
+      <w:r>
+        <w:rPr>
+          <w:rStyle w:val="VerbatimChar"/>
+        </w:rPr>
+        <w:t xml:space="preserve">AnnData</w:t>
+      </w:r>
+      <w:r>
+        <w:t xml:space="preserve"> </w:t>
+      </w:r>
+      <w:r>
+        <w:t xml:space="preserve">objects and Xenium-style spatial transcriptomics outputs. The same conceptual workflow also supports transcript-by-cell and entity-to-cell analyses, allowing the method to move beyond cell-type neighborhood summaries toward segment-free or molecule-aware spatial evidence.</w:t>
+      </w:r>
+    </w:p>
+    <w:p>
+      <w:pPr>
+        <w:pStyle w:val="BodyText"/>
+      </w:pPr>
+      <w:r>
+        <w:t xml:space="preserve">The current executable is therefore best presented as a companion tool for applying COSTE workflows on Windows, especially for researchers who want to inspect coordinate-table or Xenium-derived StructureMap results without installing a Python environment.</w:t>
+      </w:r>
+    </w:p>
+    <w:bookmarkEnd w:id="10"/>
+    <w:bookmarkStart w:id="13" w:name="build-characteristics"/>
+    <w:p>
+      <w:pPr>
+        <w:pStyle w:val="Heading2"/>
+      </w:pPr>
+      <w:r>
+        <w:t xml:space="preserve">3. Build Characteristics</w:t>
+      </w:r>
+    </w:p>
+    <w:p>
+      <w:pPr>
+        <w:pStyle w:val="FirstParagraph"/>
+      </w:pPr>
+      <w:r>
+        <w:t xml:space="preserve">The current official release has the following characteristics:</w:t>
       </w:r>
     </w:p>
     <w:p>
@@ -235,16 +300,83 @@
         </w:numPr>
       </w:pPr>
       <w:r>
-        <w:t xml:space="preserve">optimized build size: about</w:t>
-      </w:r>
-      <w:r>
-        <w:t xml:space="preserve"> </w:t>
-      </w:r>
-      <w:r>
-        <w:rPr>
-          <w:rStyle w:val="VerbatimChar"/>
-        </w:rPr>
-        <w:t xml:space="preserve">277 MB</w:t>
+        <w:t xml:space="preserve">official release file:</w:t>
+      </w:r>
+      <w:r>
+        <w:t xml:space="preserve"> </w:t>
+      </w:r>
+      <w:r>
+        <w:rPr>
+          <w:rStyle w:val="VerbatimChar"/>
+        </w:rPr>
+        <w:t xml:space="preserve">cellgps.exe</w:t>
+      </w:r>
+    </w:p>
+    <w:p>
+      <w:pPr>
+        <w:pStyle w:val="Compact"/>
+        <w:numPr>
+          <w:ilvl w:val="0"/>
+          <w:numId w:val="1003"/>
+        </w:numPr>
+      </w:pPr>
+      <w:r>
+        <w:t xml:space="preserve">official latest open v2 DOI:</w:t>
+      </w:r>
+      <w:r>
+        <w:t xml:space="preserve"> </w:t>
+      </w:r>
+      <w:hyperlink r:id="rId11">
+        <w:r>
+          <w:rPr>
+            <w:rStyle w:val="Hyperlink"/>
+          </w:rPr>
+          <w:t xml:space="preserve">https://doi.org/10.5281/zenodo.19482685</w:t>
+        </w:r>
+      </w:hyperlink>
+    </w:p>
+    <w:p>
+      <w:pPr>
+        <w:pStyle w:val="Compact"/>
+        <w:numPr>
+          <w:ilvl w:val="0"/>
+          <w:numId w:val="1003"/>
+        </w:numPr>
+      </w:pPr>
+      <w:r>
+        <w:t xml:space="preserve">version-series route:</w:t>
+      </w:r>
+      <w:r>
+        <w:t xml:space="preserve"> </w:t>
+      </w:r>
+      <w:hyperlink r:id="rId12">
+        <w:r>
+          <w:rPr>
+            <w:rStyle w:val="Hyperlink"/>
+          </w:rPr>
+          <w:t xml:space="preserve">https://zenodo.org/records/17859173</w:t>
+        </w:r>
+      </w:hyperlink>
+    </w:p>
+    <w:p>
+      <w:pPr>
+        <w:pStyle w:val="Compact"/>
+        <w:numPr>
+          <w:ilvl w:val="0"/>
+          <w:numId w:val="1003"/>
+        </w:numPr>
+      </w:pPr>
+      <w:r>
+        <w:t xml:space="preserve">official release size: about</w:t>
+      </w:r>
+      <w:r>
+        <w:t xml:space="preserve"> </w:t>
+      </w:r>
+      <w:r>
+        <w:rPr>
+          <w:rStyle w:val="VerbatimChar"/>
+        </w:rPr>
+        <w:t xml:space="preserve">297 MB</w:t>
       </w:r>
     </w:p>
     <w:p>
@@ -252,17 +384,17 @@
         <w:pStyle w:val="FirstParagraph"/>
       </w:pPr>
       <w:r>
-        <w:t xml:space="preserve">Compared with the previous build that was inspected earlier, the optimized build is substantially smaller.</w:t>
-      </w:r>
-    </w:p>
-    <w:bookmarkEnd w:id="10"/>
-    <w:bookmarkStart w:id="11" w:name="what-was-improved"/>
+        <w:t xml:space="preserve">This release prioritizes stability and compatibility for the CSV and Xenium workflows over aggressive size reduction.</w:t>
+      </w:r>
+    </w:p>
+    <w:bookmarkEnd w:id="13"/>
+    <w:bookmarkStart w:id="14" w:name="release-status"/>
     <w:p>
       <w:pPr>
         <w:pStyle w:val="Heading2"/>
       </w:pPr>
       <w:r>
-        <w:t xml:space="preserve">3. What Was Improved</w:t>
+        <w:t xml:space="preserve">4. Release Status</w:t>
       </w:r>
     </w:p>
     <w:p>
@@ -270,141 +402,62 @@
         <w:pStyle w:val="FirstParagraph"/>
       </w:pPr>
       <w:r>
-        <w:t xml:space="preserve">The following improvements were made to the packaging path:</w:t>
-      </w:r>
-    </w:p>
-    <w:p>
-      <w:pPr>
+        <w:t xml:space="preserve">The distributed executable should be treated as the official release build:</w:t>
+      </w:r>
+    </w:p>
+    <w:p>
+      <w:pPr>
+        <w:pStyle w:val="Compact"/>
         <w:numPr>
           <w:ilvl w:val="0"/>
           <w:numId w:val="1004"/>
         </w:numPr>
       </w:pPr>
       <w:r>
-        <w:t xml:space="preserve">The GUI no longer imports the full</w:t>
-      </w:r>
-      <w:r>
-        <w:t xml:space="preserve"> </w:t>
-      </w:r>
-      <w:r>
-        <w:rPr>
-          <w:rStyle w:val="VerbatimChar"/>
-        </w:rPr>
-        <w:t xml:space="preserve">cellgps</w:t>
-      </w:r>
-      <w:r>
-        <w:t xml:space="preserve"> </w:t>
-      </w:r>
-      <w:r>
-        <w:t xml:space="preserve">top-level package at startup.</w:t>
-      </w:r>
-      <w:r>
-        <w:t xml:space="preserve"> </w:t>
-      </w:r>
-      <w:r>
-        <w:t xml:space="preserve">It now loads only the modules it actually needs.</w:t>
-      </w:r>
-    </w:p>
-    <w:p>
-      <w:pPr>
+        <w:t xml:space="preserve">the release filename is</w:t>
+      </w:r>
+      <w:r>
+        <w:t xml:space="preserve"> </w:t>
+      </w:r>
+      <w:r>
+        <w:rPr>
+          <w:rStyle w:val="VerbatimChar"/>
+        </w:rPr>
+        <w:t xml:space="preserve">cellgps.exe</w:t>
+      </w:r>
+    </w:p>
+    <w:p>
+      <w:pPr>
+        <w:pStyle w:val="Compact"/>
         <w:numPr>
           <w:ilvl w:val="0"/>
           <w:numId w:val="1004"/>
         </w:numPr>
       </w:pPr>
       <w:r>
-        <w:t xml:space="preserve">The package-level</w:t>
-      </w:r>
-      <w:r>
-        <w:t xml:space="preserve"> </w:t>
-      </w:r>
-      <w:r>
-        <w:rPr>
-          <w:rStyle w:val="VerbatimChar"/>
-        </w:rPr>
-        <w:t xml:space="preserve">cellgps.__init__</w:t>
-      </w:r>
-      <w:r>
-        <w:t xml:space="preserve"> </w:t>
-      </w:r>
-      <w:r>
-        <w:t xml:space="preserve">file was rewritten to use lazy exports.</w:t>
-      </w:r>
-      <w:r>
-        <w:t xml:space="preserve"> </w:t>
-      </w:r>
-      <w:r>
-        <w:t xml:space="preserve">This keeps the public API intact while avoiding eager imports of unrelated modules.</w:t>
-      </w:r>
-    </w:p>
-    <w:p>
-      <w:pPr>
+        <w:t xml:space="preserve">older experimental or intermediate packaging variants should not be distributed</w:t>
+      </w:r>
+    </w:p>
+    <w:p>
+      <w:pPr>
+        <w:pStyle w:val="Compact"/>
         <w:numPr>
           <w:ilvl w:val="0"/>
           <w:numId w:val="1004"/>
         </w:numPr>
       </w:pPr>
       <w:r>
-        <w:rPr>
-          <w:rStyle w:val="VerbatimChar"/>
-        </w:rPr>
-        <w:t xml:space="preserve">scanpy</w:t>
-      </w:r>
-      <w:r>
-        <w:t xml:space="preserve"> </w:t>
-      </w:r>
-      <w:r>
-        <w:t xml:space="preserve">was made optional at runtime inside the Xenium loading workflow.</w:t>
-      </w:r>
-      <w:r>
-        <w:t xml:space="preserve"> </w:t>
-      </w:r>
-      <w:r>
-        <w:t xml:space="preserve">It is only imported when normalization is explicitly requested.</w:t>
-      </w:r>
-    </w:p>
-    <w:p>
-      <w:pPr>
-        <w:numPr>
-          <w:ilvl w:val="0"/>
-          <w:numId w:val="1004"/>
-        </w:numPr>
-      </w:pPr>
-      <w:r>
-        <w:t xml:space="preserve">The custom PyInstaller runtime hook was simplified.</w:t>
-      </w:r>
-      <w:r>
-        <w:t xml:space="preserve"> </w:t>
-      </w:r>
-      <w:r>
-        <w:t xml:space="preserve">It now focuses on Tcl/Tk path setup and exception logging instead of manipulating Tk root window creation.</w:t>
-      </w:r>
-    </w:p>
-    <w:p>
-      <w:pPr>
-        <w:numPr>
-          <w:ilvl w:val="0"/>
-          <w:numId w:val="1004"/>
-        </w:numPr>
-      </w:pPr>
-      <w:r>
-        <w:t xml:space="preserve">A fixed PyInstaller spec file and build script were added.</w:t>
-      </w:r>
-      <w:r>
-        <w:t xml:space="preserve"> </w:t>
-      </w:r>
-      <w:r>
-        <w:t xml:space="preserve">This makes future builds more reproducible.</w:t>
-      </w:r>
-    </w:p>
-    <w:bookmarkEnd w:id="11"/>
-    <w:bookmarkStart w:id="12" w:name="standalone-verdict"/>
+        <w:t xml:space="preserve">the current release was finalized after compatibility-focused packaging adjustments for the Xenium workflow</w:t>
+      </w:r>
+    </w:p>
+    <w:bookmarkEnd w:id="14"/>
+    <w:bookmarkStart w:id="15" w:name="standalone-verdict"/>
     <w:p>
       <w:pPr>
         <w:pStyle w:val="Heading2"/>
       </w:pPr>
       <w:r>
-        <w:t xml:space="preserve">4. Standalone Verdict</w:t>
+        <w:t xml:space="preserve">5. Standalone Verdict</w:t>
       </w:r>
     </w:p>
     <w:p>
@@ -486,14 +539,14 @@
         <w:t xml:space="preserve">In practical terms, most researchers should be able to download the file, copy it to a local folder, and run it without installing extra software.</w:t>
       </w:r>
     </w:p>
-    <w:bookmarkEnd w:id="12"/>
-    <w:bookmarkStart w:id="13" w:name="known-limitations"/>
+    <w:bookmarkEnd w:id="15"/>
+    <w:bookmarkStart w:id="16" w:name="known-limitations"/>
     <w:p>
       <w:pPr>
         <w:pStyle w:val="Heading2"/>
       </w:pPr>
       <w:r>
-        <w:t xml:space="preserve">5. Known Limitations</w:t>
+        <w:t xml:space="preserve">6. Known Limitations</w:t>
       </w:r>
     </w:p>
     <w:p>
@@ -581,14 +634,14 @@
         <w:t xml:space="preserve">That folder therefore needs write permission.</w:t>
       </w:r>
     </w:p>
-    <w:bookmarkEnd w:id="13"/>
-    <w:bookmarkStart w:id="14" w:name="recommended-distribution-practice"/>
+    <w:bookmarkEnd w:id="16"/>
+    <w:bookmarkStart w:id="17" w:name="recommended-distribution-practice"/>
     <w:p>
       <w:pPr>
         <w:pStyle w:val="Heading2"/>
       </w:pPr>
       <w:r>
-        <w:t xml:space="preserve">6. Recommended Distribution Practice</w:t>
+        <w:t xml:space="preserve">7. Recommended Distribution Practice</w:t>
       </w:r>
     </w:p>
     <w:p>
@@ -672,14 +725,14 @@
         <w:t xml:space="preserve">Cell-GPS is a Windows 64-bit single-file desktop build that already contains the required Python runtime and major dependencies. In most cases, no additional software installation is needed. The first launch may take longer because the application unpacks its runtime files into the user’s temporary directory.</w:t>
       </w:r>
     </w:p>
-    <w:bookmarkEnd w:id="14"/>
-    <w:bookmarkStart w:id="15" w:name="system-requirements"/>
+    <w:bookmarkEnd w:id="17"/>
+    <w:bookmarkStart w:id="18" w:name="system-requirements"/>
     <w:p>
       <w:pPr>
         <w:pStyle w:val="Heading2"/>
       </w:pPr>
       <w:r>
-        <w:t xml:space="preserve">7. System Requirements</w:t>
+        <w:t xml:space="preserve">8. System Requirements</w:t>
       </w:r>
     </w:p>
     <w:p>
@@ -739,23 +792,23 @@
         <w:t xml:space="preserve">permission to read input datasets and write to the local temporary directory</w:t>
       </w:r>
     </w:p>
-    <w:bookmarkEnd w:id="15"/>
-    <w:bookmarkStart w:id="19" w:name="before-launching-the-program"/>
+    <w:bookmarkEnd w:id="18"/>
+    <w:bookmarkStart w:id="22" w:name="before-launching-the-program"/>
     <w:p>
       <w:pPr>
         <w:pStyle w:val="Heading2"/>
       </w:pPr>
       <w:r>
-        <w:t xml:space="preserve">8. Before Launching the Program</w:t>
-      </w:r>
-    </w:p>
-    <w:bookmarkStart w:id="16" w:name="copy-the-executable-to-a-local-disk"/>
+        <w:t xml:space="preserve">9. Before Launching the Program</w:t>
+      </w:r>
+    </w:p>
+    <w:bookmarkStart w:id="19" w:name="copy-the-executable-to-a-local-disk"/>
     <w:p>
       <w:pPr>
         <w:pStyle w:val="Heading3"/>
       </w:pPr>
       <w:r>
-        <w:t xml:space="preserve">8.1 Copy the executable to a local disk</w:t>
+        <w:t xml:space="preserve">9.1 Copy the executable to a local disk</w:t>
       </w:r>
     </w:p>
     <w:p>
@@ -840,14 +893,14 @@
         <w:t xml:space="preserve">C:\Users\&lt;username&gt;\Downloads\Cell-GPS\cellgps.exe</w:t>
       </w:r>
     </w:p>
-    <w:bookmarkEnd w:id="16"/>
-    <w:bookmarkStart w:id="17" w:name="X914d56097996ca8eb028f3eb8bd5451271aa55d"/>
+    <w:bookmarkEnd w:id="19"/>
+    <w:bookmarkStart w:id="20" w:name="X914d56097996ca8eb028f3eb8bd5451271aa55d"/>
     <w:p>
       <w:pPr>
         <w:pStyle w:val="Heading3"/>
       </w:pPr>
       <w:r>
-        <w:t xml:space="preserve">8.2 Unblock the file if Windows marked it as downloaded</w:t>
+        <w:t xml:space="preserve">9.2 Unblock the file if Windows marked it as downloaded</w:t>
       </w:r>
     </w:p>
     <w:p>
@@ -963,14 +1016,14 @@
         <w:t xml:space="preserve">OK</w:t>
       </w:r>
     </w:p>
-    <w:bookmarkEnd w:id="17"/>
-    <w:bookmarkStart w:id="18" w:name="security-software-may-intervene"/>
+    <w:bookmarkEnd w:id="20"/>
+    <w:bookmarkStart w:id="21" w:name="security-software-may-intervene"/>
     <w:p>
       <w:pPr>
         <w:pStyle w:val="Heading3"/>
       </w:pPr>
       <w:r>
-        <w:t xml:space="preserve">8.3 Security software may intervene</w:t>
+        <w:t xml:space="preserve">9.3 Security software may intervene</w:t>
       </w:r>
     </w:p>
     <w:p>
@@ -1013,15 +1066,15 @@
         <w:t xml:space="preserve">or ask their IT/security team to whitelist it</w:t>
       </w:r>
     </w:p>
-    <w:bookmarkEnd w:id="18"/>
-    <w:bookmarkEnd w:id="19"/>
-    <w:bookmarkStart w:id="20" w:name="launch-instructions"/>
+    <w:bookmarkEnd w:id="21"/>
+    <w:bookmarkEnd w:id="22"/>
+    <w:bookmarkStart w:id="23" w:name="launch-instructions"/>
     <w:p>
       <w:pPr>
         <w:pStyle w:val="Heading2"/>
       </w:pPr>
       <w:r>
-        <w:t xml:space="preserve">9. Launch Instructions</w:t>
+        <w:t xml:space="preserve">10. Launch Instructions</w:t>
       </w:r>
     </w:p>
     <w:p>
@@ -1124,14 +1177,14 @@
         <w:t xml:space="preserve">if no window appears immediately, wait before assuming the launch failed</w:t>
       </w:r>
     </w:p>
-    <w:bookmarkEnd w:id="20"/>
-    <w:bookmarkStart w:id="21" w:name="gui-overview"/>
+    <w:bookmarkEnd w:id="23"/>
+    <w:bookmarkStart w:id="24" w:name="gui-overview"/>
     <w:p>
       <w:pPr>
         <w:pStyle w:val="Heading2"/>
       </w:pPr>
       <w:r>
-        <w:t xml:space="preserve">10. GUI Overview</w:t>
+        <w:t xml:space="preserve">11. GUI Overview</w:t>
       </w:r>
     </w:p>
     <w:p>
@@ -1172,23 +1225,23 @@
         <w:t xml:space="preserve">Xenium Heatmap</w:t>
       </w:r>
     </w:p>
-    <w:bookmarkEnd w:id="21"/>
-    <w:bookmarkStart w:id="25" w:name="csv-heatmap-workflow"/>
+    <w:bookmarkEnd w:id="24"/>
+    <w:bookmarkStart w:id="28" w:name="csv-heatmap-workflow"/>
     <w:p>
       <w:pPr>
         <w:pStyle w:val="Heading2"/>
       </w:pPr>
       <w:r>
-        <w:t xml:space="preserve">11. CSV Heatmap Workflow</w:t>
-      </w:r>
-    </w:p>
-    <w:bookmarkStart w:id="22" w:name="required-input"/>
+        <w:t xml:space="preserve">12. CSV Heatmap Workflow</w:t>
+      </w:r>
+    </w:p>
+    <w:bookmarkStart w:id="25" w:name="required-input"/>
     <w:p>
       <w:pPr>
         <w:pStyle w:val="Heading3"/>
       </w:pPr>
       <w:r>
-        <w:t xml:space="preserve">11.1 Required input</w:t>
+        <w:t xml:space="preserve">12.1 Required input</w:t>
       </w:r>
     </w:p>
     <w:p>
@@ -1252,14 +1305,14 @@
         <w:t xml:space="preserve">If the file uses different column names, the current GUI does not provide a column-mapping dialog, and the workflow will fail.</w:t>
       </w:r>
     </w:p>
-    <w:bookmarkEnd w:id="22"/>
-    <w:bookmarkStart w:id="23" w:name="steps"/>
+    <w:bookmarkEnd w:id="25"/>
+    <w:bookmarkStart w:id="26" w:name="steps"/>
     <w:p>
       <w:pPr>
         <w:pStyle w:val="Heading3"/>
       </w:pPr>
       <w:r>
-        <w:t xml:space="preserve">11.2 Steps</w:t>
+        <w:t xml:space="preserve">12.2 Steps</w:t>
       </w:r>
     </w:p>
     <w:p>
@@ -1406,14 +1459,14 @@
         <w:t xml:space="preserve">if needed</w:t>
       </w:r>
     </w:p>
-    <w:bookmarkEnd w:id="23"/>
-    <w:bookmarkStart w:id="24" w:name="output-behavior"/>
+    <w:bookmarkEnd w:id="26"/>
+    <w:bookmarkStart w:id="27" w:name="output-behavior"/>
     <w:p>
       <w:pPr>
         <w:pStyle w:val="Heading3"/>
       </w:pPr>
       <w:r>
-        <w:t xml:space="preserve">11.3 Output behavior</w:t>
+        <w:t xml:space="preserve">12.3 Output behavior</w:t>
       </w:r>
     </w:p>
     <w:p>
@@ -1432,24 +1485,24 @@
         <w:t xml:space="preserve">At the moment, there is no dedicated export button in the GUI, so users should treat the current build primarily as an analysis-and-preview interface.</w:t>
       </w:r>
     </w:p>
-    <w:bookmarkEnd w:id="24"/>
-    <w:bookmarkEnd w:id="25"/>
-    <w:bookmarkStart w:id="30" w:name="xenium-heatmap-workflow"/>
+    <w:bookmarkEnd w:id="27"/>
+    <w:bookmarkEnd w:id="28"/>
+    <w:bookmarkStart w:id="33" w:name="xenium-heatmap-workflow"/>
     <w:p>
       <w:pPr>
         <w:pStyle w:val="Heading2"/>
       </w:pPr>
       <w:r>
-        <w:t xml:space="preserve">12. Xenium Heatmap Workflow</w:t>
-      </w:r>
-    </w:p>
-    <w:bookmarkStart w:id="26" w:name="expected-xenium-folder-structure"/>
+        <w:t xml:space="preserve">13. Xenium Heatmap Workflow</w:t>
+      </w:r>
+    </w:p>
+    <w:bookmarkStart w:id="29" w:name="expected-xenium-folder-structure"/>
     <w:p>
       <w:pPr>
         <w:pStyle w:val="Heading3"/>
       </w:pPr>
       <w:r>
-        <w:t xml:space="preserve">12.1 Expected Xenium folder structure</w:t>
+        <w:t xml:space="preserve">13.1 Expected Xenium folder structure</w:t>
       </w:r>
     </w:p>
     <w:p>
@@ -1526,14 +1579,14 @@
         <w:t xml:space="preserve">analysis.h5</w:t>
       </w:r>
     </w:p>
-    <w:bookmarkEnd w:id="26"/>
-    <w:bookmarkStart w:id="27" w:name="required-selection-csv"/>
+    <w:bookmarkEnd w:id="29"/>
+    <w:bookmarkStart w:id="30" w:name="required-selection-csv"/>
     <w:p>
       <w:pPr>
         <w:pStyle w:val="Heading3"/>
       </w:pPr>
       <w:r>
-        <w:t xml:space="preserve">12.2 Required selection CSV</w:t>
+        <w:t xml:space="preserve">13.2 Required selection CSV</w:t>
       </w:r>
     </w:p>
     <w:p>
@@ -1567,14 +1620,14 @@
         <w:t xml:space="preserve">The program uses this column to select cells from the loaded Xenium dataset.</w:t>
       </w:r>
     </w:p>
-    <w:bookmarkEnd w:id="27"/>
-    <w:bookmarkStart w:id="28" w:name="steps-1"/>
+    <w:bookmarkEnd w:id="30"/>
+    <w:bookmarkStart w:id="31" w:name="steps-1"/>
     <w:p>
       <w:pPr>
         <w:pStyle w:val="Heading3"/>
       </w:pPr>
       <w:r>
-        <w:t xml:space="preserve">12.3 Steps</w:t>
+        <w:t xml:space="preserve">13.3 Steps</w:t>
       </w:r>
     </w:p>
     <w:p>
@@ -1763,14 +1816,14 @@
         <w:t xml:space="preserve">Wait for the result to appear in the display panel</w:t>
       </w:r>
     </w:p>
-    <w:bookmarkEnd w:id="28"/>
-    <w:bookmarkStart w:id="29" w:name="important-note-about-write-access"/>
+    <w:bookmarkEnd w:id="31"/>
+    <w:bookmarkStart w:id="32" w:name="important-note-about-write-access"/>
     <w:p>
       <w:pPr>
         <w:pStyle w:val="Heading3"/>
       </w:pPr>
       <w:r>
-        <w:t xml:space="preserve">12.4 Important note about write access</w:t>
+        <w:t xml:space="preserve">13.4 Important note about write access</w:t>
       </w:r>
     </w:p>
     <w:p>
@@ -1836,24 +1889,24 @@
         <w:t xml:space="preserve">If users want to avoid changing the original dataset folder, they should work on a local copy.</w:t>
       </w:r>
     </w:p>
-    <w:bookmarkEnd w:id="29"/>
-    <w:bookmarkEnd w:id="30"/>
-    <w:bookmarkStart w:id="35" w:name="troubleshooting"/>
+    <w:bookmarkEnd w:id="32"/>
+    <w:bookmarkEnd w:id="33"/>
+    <w:bookmarkStart w:id="38" w:name="troubleshooting"/>
     <w:p>
       <w:pPr>
         <w:pStyle w:val="Heading2"/>
       </w:pPr>
       <w:r>
-        <w:t xml:space="preserve">13. Troubleshooting</w:t>
-      </w:r>
-    </w:p>
-    <w:bookmarkStart w:id="31" w:name="nothing-appears-when-double-clicking"/>
+        <w:t xml:space="preserve">14. Troubleshooting</w:t>
+      </w:r>
+    </w:p>
+    <w:bookmarkStart w:id="34" w:name="nothing-appears-when-double-clicking"/>
     <w:p>
       <w:pPr>
         <w:pStyle w:val="Heading3"/>
       </w:pPr>
       <w:r>
-        <w:t xml:space="preserve">13.1 Nothing appears when double-clicking</w:t>
+        <w:t xml:space="preserve">14.1 Nothing appears when double-clicking</w:t>
       </w:r>
     </w:p>
     <w:p>
@@ -1912,14 +1965,14 @@
         <w:t xml:space="preserve">the program has been given enough time to finish first-time extraction</w:t>
       </w:r>
     </w:p>
-    <w:bookmarkEnd w:id="31"/>
-    <w:bookmarkStart w:id="32" w:name="the-program-opens-and-then-fails"/>
+    <w:bookmarkEnd w:id="34"/>
+    <w:bookmarkStart w:id="35" w:name="the-program-opens-and-then-fails"/>
     <w:p>
       <w:pPr>
         <w:pStyle w:val="Heading3"/>
       </w:pPr>
       <w:r>
-        <w:t xml:space="preserve">13.2 The program opens and then fails</w:t>
+        <w:t xml:space="preserve">14.2 The program opens and then fails</w:t>
       </w:r>
     </w:p>
     <w:p>
@@ -1953,14 +2006,14 @@
         <w:t xml:space="preserve">This is the main runtime error log for the packaged build.</w:t>
       </w:r>
     </w:p>
-    <w:bookmarkEnd w:id="32"/>
-    <w:bookmarkStart w:id="33" w:name="X998760e87995d5eb06d9f97a723469ac4097468"/>
+    <w:bookmarkEnd w:id="35"/>
+    <w:bookmarkStart w:id="36" w:name="X998760e87995d5eb06d9f97a723469ac4097468"/>
     <w:p>
       <w:pPr>
         <w:pStyle w:val="Heading3"/>
       </w:pPr>
       <w:r>
-        <w:t xml:space="preserve">13.3 Can researchers on other computers run it?</w:t>
+        <w:t xml:space="preserve">14.3 Can researchers on other computers run it?</w:t>
       </w:r>
     </w:p>
     <w:p>
@@ -2022,14 +2075,14 @@
         <w:t xml:space="preserve">valid input data in the expected format</w:t>
       </w:r>
     </w:p>
-    <w:bookmarkEnd w:id="33"/>
-    <w:bookmarkStart w:id="34" w:name="why-is-the-file-still-large"/>
+    <w:bookmarkEnd w:id="36"/>
+    <w:bookmarkStart w:id="37" w:name="why-is-the-file-still-large"/>
     <w:p>
       <w:pPr>
         <w:pStyle w:val="Heading3"/>
       </w:pPr>
       <w:r>
-        <w:t xml:space="preserve">13.4 Why is the file still large?</w:t>
+        <w:t xml:space="preserve">14.4 Why is the file still large?</w:t>
       </w:r>
     </w:p>
     <w:p>
@@ -2045,255 +2098,255 @@
         <w:pStyle w:val="BodyText"/>
       </w:pPr>
       <w:r>
-        <w:t xml:space="preserve">The optimized build is smaller than the earlier build, but it is still a scientific desktop executable rather than a minimal native utility.</w:t>
-      </w:r>
-    </w:p>
-    <w:bookmarkEnd w:id="34"/>
-    <w:bookmarkEnd w:id="35"/>
-    <w:bookmarkStart w:id="36" w:name="X1c66aabcf4f3ff249ea781839c3ff98fb985144"/>
-    <w:p>
-      <w:pPr>
-        <w:pStyle w:val="Heading2"/>
-      </w:pPr>
-      <w:r>
-        <w:t xml:space="preserve">14. Recommended Final Validation Before Public Release</w:t>
-      </w:r>
-    </w:p>
-    <w:p>
-      <w:pPr>
-        <w:pStyle w:val="FirstParagraph"/>
-      </w:pPr>
-      <w:r>
-        <w:t xml:space="preserve">Before publishing globally, run one final smoke test on a clean Windows x64 machine that does not have your local Python or Conda development setup.</w:t>
-      </w:r>
-    </w:p>
-    <w:p>
-      <w:pPr>
-        <w:pStyle w:val="BodyText"/>
-      </w:pPr>
-      <w:r>
-        <w:t xml:space="preserve">Recommended checklist:</w:t>
-      </w:r>
-    </w:p>
-    <w:p>
-      <w:pPr>
-        <w:pStyle w:val="Compact"/>
-        <w:numPr>
-          <w:ilvl w:val="0"/>
-          <w:numId w:val="1024"/>
-        </w:numPr>
-      </w:pPr>
-      <w:r>
-        <w:t xml:space="preserve">Copy only</w:t>
-      </w:r>
-      <w:r>
-        <w:t xml:space="preserve"> </w:t>
-      </w:r>
-      <w:r>
-        <w:rPr>
-          <w:rStyle w:val="VerbatimChar"/>
-        </w:rPr>
-        <w:t xml:space="preserve">cellgps.exe</w:t>
-      </w:r>
-      <w:r>
-        <w:t xml:space="preserve"> </w:t>
-      </w:r>
-      <w:r>
-        <w:t xml:space="preserve">to the machine</w:t>
-      </w:r>
-    </w:p>
-    <w:p>
-      <w:pPr>
-        <w:pStyle w:val="Compact"/>
-        <w:numPr>
-          <w:ilvl w:val="0"/>
-          <w:numId w:val="1024"/>
-        </w:numPr>
-      </w:pPr>
-      <w:r>
-        <w:t xml:space="preserve">Launch the executable</w:t>
-      </w:r>
-    </w:p>
-    <w:p>
-      <w:pPr>
-        <w:pStyle w:val="Compact"/>
-        <w:numPr>
-          <w:ilvl w:val="0"/>
-          <w:numId w:val="1024"/>
-        </w:numPr>
-      </w:pPr>
-      <w:r>
-        <w:t xml:space="preserve">Run a small</w:t>
-      </w:r>
-      <w:r>
-        <w:t xml:space="preserve"> </w:t>
-      </w:r>
-      <w:r>
-        <w:rPr>
-          <w:rStyle w:val="VerbatimChar"/>
-        </w:rPr>
-        <w:t xml:space="preserve">CSV Heatmap</w:t>
-      </w:r>
-      <w:r>
-        <w:t xml:space="preserve"> </w:t>
-      </w:r>
-      <w:r>
-        <w:t xml:space="preserve">example</w:t>
-      </w:r>
-    </w:p>
-    <w:p>
-      <w:pPr>
-        <w:pStyle w:val="Compact"/>
-        <w:numPr>
-          <w:ilvl w:val="0"/>
-          <w:numId w:val="1024"/>
-        </w:numPr>
-      </w:pPr>
-      <w:r>
-        <w:t xml:space="preserve">Run a small</w:t>
-      </w:r>
-      <w:r>
-        <w:t xml:space="preserve"> </w:t>
-      </w:r>
-      <w:r>
-        <w:rPr>
-          <w:rStyle w:val="VerbatimChar"/>
-        </w:rPr>
-        <w:t xml:space="preserve">Xenium Heatmap</w:t>
-      </w:r>
-      <w:r>
-        <w:t xml:space="preserve"> </w:t>
-      </w:r>
-      <w:r>
-        <w:t xml:space="preserve">example</w:t>
-      </w:r>
-    </w:p>
-    <w:p>
-      <w:pPr>
-        <w:pStyle w:val="Compact"/>
-        <w:numPr>
-          <w:ilvl w:val="0"/>
-          <w:numId w:val="1024"/>
-        </w:numPr>
-      </w:pPr>
-      <w:r>
-        <w:t xml:space="preserve">Confirm that no unexpected</w:t>
-      </w:r>
-      <w:r>
-        <w:t xml:space="preserve"> </w:t>
-      </w:r>
-      <w:r>
-        <w:rPr>
-          <w:rStyle w:val="VerbatimChar"/>
-        </w:rPr>
-        <w:t xml:space="preserve">error.log</w:t>
-      </w:r>
-      <w:r>
-        <w:t xml:space="preserve"> </w:t>
-      </w:r>
-      <w:r>
-        <w:t xml:space="preserve">is created</w:t>
-      </w:r>
-    </w:p>
-    <w:p>
-      <w:pPr>
-        <w:pStyle w:val="Compact"/>
-        <w:numPr>
-          <w:ilvl w:val="0"/>
-          <w:numId w:val="1024"/>
-        </w:numPr>
-      </w:pPr>
-      <w:r>
-        <w:t xml:space="preserve">Confirm that startup time is acceptable</w:t>
-      </w:r>
-    </w:p>
-    <w:bookmarkEnd w:id="36"/>
-    <w:bookmarkStart w:id="37" w:name="final-assessment"/>
-    <w:p>
-      <w:pPr>
-        <w:pStyle w:val="Heading2"/>
-      </w:pPr>
-      <w:r>
-        <w:t xml:space="preserve">15. Final Assessment</w:t>
-      </w:r>
-    </w:p>
-    <w:p>
-      <w:pPr>
-        <w:pStyle w:val="FirstParagraph"/>
-      </w:pPr>
-      <w:r>
-        <w:t xml:space="preserve">The optimized</w:t>
-      </w:r>
-      <w:r>
-        <w:t xml:space="preserve"> </w:t>
-      </w:r>
-      <w:r>
-        <w:rPr>
-          <w:rStyle w:val="VerbatimChar"/>
-        </w:rPr>
-        <w:t xml:space="preserve">cellgps.exe</w:t>
-      </w:r>
-      <w:r>
-        <w:t xml:space="preserve"> </w:t>
-      </w:r>
-      <w:r>
-        <w:t xml:space="preserve">is suitable for distribution to external researchers as a standalone Windows GUI application.</w:t>
-      </w:r>
-    </w:p>
-    <w:p>
-      <w:pPr>
-        <w:pStyle w:val="BodyText"/>
-      </w:pPr>
-      <w:r>
-        <w:t xml:space="preserve">It should be described as:</w:t>
-      </w:r>
-    </w:p>
-    <w:p>
-      <w:pPr>
-        <w:pStyle w:val="Compact"/>
-        <w:numPr>
-          <w:ilvl w:val="0"/>
-          <w:numId w:val="1025"/>
-        </w:numPr>
-      </w:pPr>
-      <w:r>
-        <w:t xml:space="preserve">a single-file Windows x64 scientific desktop application</w:t>
-      </w:r>
-    </w:p>
-    <w:p>
-      <w:pPr>
-        <w:pStyle w:val="Compact"/>
-        <w:numPr>
-          <w:ilvl w:val="0"/>
-          <w:numId w:val="1025"/>
-        </w:numPr>
-      </w:pPr>
-      <w:r>
-        <w:t xml:space="preserve">with bundled runtime dependencies</w:t>
-      </w:r>
-    </w:p>
-    <w:p>
-      <w:pPr>
-        <w:pStyle w:val="Compact"/>
-        <w:numPr>
-          <w:ilvl w:val="0"/>
-          <w:numId w:val="1025"/>
-        </w:numPr>
-      </w:pPr>
-      <w:r>
-        <w:t xml:space="preserve">requiring no separate Python installation for normal users</w:t>
-      </w:r>
-    </w:p>
-    <w:p>
-      <w:pPr>
-        <w:pStyle w:val="FirstParagraph"/>
-      </w:pPr>
-      <w:r>
-        <w:t xml:space="preserve">That is an accurate and defensible description for global distribution.</w:t>
+        <w:t xml:space="preserve">The official release is a compatibility-focused scientific desktop executable rather than a minimal native utility.</w:t>
       </w:r>
     </w:p>
     <w:bookmarkEnd w:id="37"/>
     <w:bookmarkEnd w:id="38"/>
+    <w:bookmarkStart w:id="39" w:name="X1c66aabcf4f3ff249ea781839c3ff98fb985144"/>
+    <w:p>
+      <w:pPr>
+        <w:pStyle w:val="Heading2"/>
+      </w:pPr>
+      <w:r>
+        <w:t xml:space="preserve">15. Recommended Final Validation Before Public Release</w:t>
+      </w:r>
+    </w:p>
+    <w:p>
+      <w:pPr>
+        <w:pStyle w:val="FirstParagraph"/>
+      </w:pPr>
+      <w:r>
+        <w:t xml:space="preserve">Before publishing globally, run one final smoke test on a clean Windows x64 machine that does not have your local Python or Conda development setup.</w:t>
+      </w:r>
+    </w:p>
+    <w:p>
+      <w:pPr>
+        <w:pStyle w:val="BodyText"/>
+      </w:pPr>
+      <w:r>
+        <w:t xml:space="preserve">Recommended checklist:</w:t>
+      </w:r>
+    </w:p>
+    <w:p>
+      <w:pPr>
+        <w:pStyle w:val="Compact"/>
+        <w:numPr>
+          <w:ilvl w:val="0"/>
+          <w:numId w:val="1024"/>
+        </w:numPr>
+      </w:pPr>
+      <w:r>
+        <w:t xml:space="preserve">Copy only</w:t>
+      </w:r>
+      <w:r>
+        <w:t xml:space="preserve"> </w:t>
+      </w:r>
+      <w:r>
+        <w:rPr>
+          <w:rStyle w:val="VerbatimChar"/>
+        </w:rPr>
+        <w:t xml:space="preserve">cellgps.exe</w:t>
+      </w:r>
+      <w:r>
+        <w:t xml:space="preserve"> </w:t>
+      </w:r>
+      <w:r>
+        <w:t xml:space="preserve">to the machine</w:t>
+      </w:r>
+    </w:p>
+    <w:p>
+      <w:pPr>
+        <w:pStyle w:val="Compact"/>
+        <w:numPr>
+          <w:ilvl w:val="0"/>
+          <w:numId w:val="1024"/>
+        </w:numPr>
+      </w:pPr>
+      <w:r>
+        <w:t xml:space="preserve">Launch the executable</w:t>
+      </w:r>
+    </w:p>
+    <w:p>
+      <w:pPr>
+        <w:pStyle w:val="Compact"/>
+        <w:numPr>
+          <w:ilvl w:val="0"/>
+          <w:numId w:val="1024"/>
+        </w:numPr>
+      </w:pPr>
+      <w:r>
+        <w:t xml:space="preserve">Run a small</w:t>
+      </w:r>
+      <w:r>
+        <w:t xml:space="preserve"> </w:t>
+      </w:r>
+      <w:r>
+        <w:rPr>
+          <w:rStyle w:val="VerbatimChar"/>
+        </w:rPr>
+        <w:t xml:space="preserve">CSV Heatmap</w:t>
+      </w:r>
+      <w:r>
+        <w:t xml:space="preserve"> </w:t>
+      </w:r>
+      <w:r>
+        <w:t xml:space="preserve">example</w:t>
+      </w:r>
+    </w:p>
+    <w:p>
+      <w:pPr>
+        <w:pStyle w:val="Compact"/>
+        <w:numPr>
+          <w:ilvl w:val="0"/>
+          <w:numId w:val="1024"/>
+        </w:numPr>
+      </w:pPr>
+      <w:r>
+        <w:t xml:space="preserve">Run a small</w:t>
+      </w:r>
+      <w:r>
+        <w:t xml:space="preserve"> </w:t>
+      </w:r>
+      <w:r>
+        <w:rPr>
+          <w:rStyle w:val="VerbatimChar"/>
+        </w:rPr>
+        <w:t xml:space="preserve">Xenium Heatmap</w:t>
+      </w:r>
+      <w:r>
+        <w:t xml:space="preserve"> </w:t>
+      </w:r>
+      <w:r>
+        <w:t xml:space="preserve">example</w:t>
+      </w:r>
+    </w:p>
+    <w:p>
+      <w:pPr>
+        <w:pStyle w:val="Compact"/>
+        <w:numPr>
+          <w:ilvl w:val="0"/>
+          <w:numId w:val="1024"/>
+        </w:numPr>
+      </w:pPr>
+      <w:r>
+        <w:t xml:space="preserve">Confirm that no unexpected</w:t>
+      </w:r>
+      <w:r>
+        <w:t xml:space="preserve"> </w:t>
+      </w:r>
+      <w:r>
+        <w:rPr>
+          <w:rStyle w:val="VerbatimChar"/>
+        </w:rPr>
+        <w:t xml:space="preserve">error.log</w:t>
+      </w:r>
+      <w:r>
+        <w:t xml:space="preserve"> </w:t>
+      </w:r>
+      <w:r>
+        <w:t xml:space="preserve">is created</w:t>
+      </w:r>
+    </w:p>
+    <w:p>
+      <w:pPr>
+        <w:pStyle w:val="Compact"/>
+        <w:numPr>
+          <w:ilvl w:val="0"/>
+          <w:numId w:val="1024"/>
+        </w:numPr>
+      </w:pPr>
+      <w:r>
+        <w:t xml:space="preserve">Confirm that startup time is acceptable</w:t>
+      </w:r>
+    </w:p>
+    <w:bookmarkEnd w:id="39"/>
+    <w:bookmarkStart w:id="40" w:name="final-assessment"/>
+    <w:p>
+      <w:pPr>
+        <w:pStyle w:val="Heading2"/>
+      </w:pPr>
+      <w:r>
+        <w:t xml:space="preserve">16. Final Assessment</w:t>
+      </w:r>
+    </w:p>
+    <w:p>
+      <w:pPr>
+        <w:pStyle w:val="FirstParagraph"/>
+      </w:pPr>
+      <w:r>
+        <w:t xml:space="preserve">The official</w:t>
+      </w:r>
+      <w:r>
+        <w:t xml:space="preserve"> </w:t>
+      </w:r>
+      <w:r>
+        <w:rPr>
+          <w:rStyle w:val="VerbatimChar"/>
+        </w:rPr>
+        <w:t xml:space="preserve">cellgps.exe</w:t>
+      </w:r>
+      <w:r>
+        <w:t xml:space="preserve"> </w:t>
+      </w:r>
+      <w:r>
+        <w:t xml:space="preserve">is suitable for distribution to external researchers as a standalone Windows GUI application.</w:t>
+      </w:r>
+    </w:p>
+    <w:p>
+      <w:pPr>
+        <w:pStyle w:val="BodyText"/>
+      </w:pPr>
+      <w:r>
+        <w:t xml:space="preserve">It should be described as:</w:t>
+      </w:r>
+    </w:p>
+    <w:p>
+      <w:pPr>
+        <w:pStyle w:val="Compact"/>
+        <w:numPr>
+          <w:ilvl w:val="0"/>
+          <w:numId w:val="1025"/>
+        </w:numPr>
+      </w:pPr>
+      <w:r>
+        <w:t xml:space="preserve">a single-file Windows x64 scientific desktop application</w:t>
+      </w:r>
+    </w:p>
+    <w:p>
+      <w:pPr>
+        <w:pStyle w:val="Compact"/>
+        <w:numPr>
+          <w:ilvl w:val="0"/>
+          <w:numId w:val="1025"/>
+        </w:numPr>
+      </w:pPr>
+      <w:r>
+        <w:t xml:space="preserve">with bundled runtime dependencies</w:t>
+      </w:r>
+    </w:p>
+    <w:p>
+      <w:pPr>
+        <w:pStyle w:val="Compact"/>
+        <w:numPr>
+          <w:ilvl w:val="0"/>
+          <w:numId w:val="1025"/>
+        </w:numPr>
+      </w:pPr>
+      <w:r>
+        <w:t xml:space="preserve">requiring no separate Python installation for normal users</w:t>
+      </w:r>
+    </w:p>
+    <w:p>
+      <w:pPr>
+        <w:pStyle w:val="FirstParagraph"/>
+      </w:pPr>
+      <w:r>
+        <w:t xml:space="preserve">That is an accurate and defensible description for global distribution.</w:t>
+      </w:r>
+    </w:p>
+    <w:bookmarkEnd w:id="40"/>
+    <w:bookmarkEnd w:id="41"/>
     <w:sectPr>
       <w:footnotePr>
         <w:numRestart w:val="eachSect"/>
@@ -2605,34 +2658,7 @@
     <w:abstractNumId w:val="991"/>
   </w:num>
   <w:num w:numId="1004">
-    <w:abstractNumId w:val="99411"/>
-    <w:lvlOverride w:ilvl="0">
-      <w:startOverride w:val="1"/>
-    </w:lvlOverride>
-    <w:lvlOverride w:ilvl="1">
-      <w:startOverride w:val="1"/>
-    </w:lvlOverride>
-    <w:lvlOverride w:ilvl="2">
-      <w:startOverride w:val="1"/>
-    </w:lvlOverride>
-    <w:lvlOverride w:ilvl="3">
-      <w:startOverride w:val="1"/>
-    </w:lvlOverride>
-    <w:lvlOverride w:ilvl="4">
-      <w:startOverride w:val="1"/>
-    </w:lvlOverride>
-    <w:lvlOverride w:ilvl="5">
-      <w:startOverride w:val="1"/>
-    </w:lvlOverride>
-    <w:lvlOverride w:ilvl="6">
-      <w:startOverride w:val="1"/>
-    </w:lvlOverride>
-    <w:lvlOverride w:ilvl="7">
-      <w:startOverride w:val="1"/>
-    </w:lvlOverride>
-    <w:lvlOverride w:ilvl="8">
-      <w:startOverride w:val="1"/>
-    </w:lvlOverride>
+    <w:abstractNumId w:val="991"/>
   </w:num>
   <w:num w:numId="1005">
     <w:abstractNumId w:val="991"/>

</xml_diff>